<commit_message>
fix(bots): show the real running version in every panel, read from GM_info
The ADP historical panel badge read v1.10.1 while @version was four releases
ahead, which cost a debugging round today: with a stale badge you cannot tell
'the fix did not work' from 'the fix is not loaded'. The same trap existed
across the fleet:

  adp-reports            @version 1.7.0   badge hardcoded 'v1.0'
  paycom-reports         @version 0.23.0  no version shown at all
  paycom-historical-data @version 0.34.0  version only in a log line, not the panel

All four now derive SCRIPT_VERSION from GM_info.script.version — the approach
paycom-historical already used for its log line, which is exactly why that one
log was always right. The literal in each script is only a fallback for when
GM_info is unavailable, and matches @version.

Verified for all four: GM_info path and fallback path both resolve to @version,
and each panel renders it.

Co-Authored-By: Claude Opus 5 <noreply@anthropic.com>
</commit_message>
<xml_diff>
--- a/distribution-docs/ADP Daily Reports Automation.docx
+++ b/distribution-docs/ADP Daily Reports Automation.docx
@@ -51,7 +51,7 @@
           <w:sz w:val="16"/>
           <w:szCs w:val="16"/>
         </w:rPr>
-        <w:t xml:space="preserve">// @version      1.7.0</w:t>
+        <w:t xml:space="preserve">// @version      1.7.1</w:t>
       </w:r>
     </w:p>
     <w:p>
@@ -246,6 +246,149 @@
           <w:sz w:val="16"/>
           <w:szCs w:val="16"/>
         </w:rPr>
+        <w:t xml:space="preserve">  // Version shown in the panel badge — read from Tampermonkey so it can never</w:t>
+      </w:r>
+    </w:p>
+    <w:p>
+      <w:pPr>
+        <w:spacing w:after="0" w:line="220"/>
+      </w:pPr>
+      <w:r>
+        <w:rPr>
+          <w:rFonts w:ascii="Consolas" w:cs="Consolas" w:eastAsia="Consolas" w:hAnsi="Consolas"/>
+          <w:sz w:val="16"/>
+          <w:szCs w:val="16"/>
+        </w:rPr>
+        <w:t xml:space="preserve">  // drift from @version the way a hardcoded copy does.</w:t>
+      </w:r>
+    </w:p>
+    <w:p>
+      <w:pPr>
+        <w:spacing w:after="0" w:line="220"/>
+      </w:pPr>
+      <w:r>
+        <w:rPr>
+          <w:rFonts w:ascii="Consolas" w:cs="Consolas" w:eastAsia="Consolas" w:hAnsi="Consolas"/>
+          <w:sz w:val="16"/>
+          <w:szCs w:val="16"/>
+        </w:rPr>
+        <w:t xml:space="preserve">  const SCRIPT_VERSION = (() =&gt; {</w:t>
+      </w:r>
+    </w:p>
+    <w:p>
+      <w:pPr>
+        <w:spacing w:after="0" w:line="220"/>
+      </w:pPr>
+      <w:r>
+        <w:rPr>
+          <w:rFonts w:ascii="Consolas" w:cs="Consolas" w:eastAsia="Consolas" w:hAnsi="Consolas"/>
+          <w:sz w:val="16"/>
+          <w:szCs w:val="16"/>
+        </w:rPr>
+        <w:t xml:space="preserve">    try {</w:t>
+      </w:r>
+    </w:p>
+    <w:p>
+      <w:pPr>
+        <w:spacing w:after="0" w:line="220"/>
+      </w:pPr>
+      <w:r>
+        <w:rPr>
+          <w:rFonts w:ascii="Consolas" w:cs="Consolas" w:eastAsia="Consolas" w:hAnsi="Consolas"/>
+          <w:sz w:val="16"/>
+          <w:szCs w:val="16"/>
+        </w:rPr>
+        <w:t xml:space="preserve">      if (typeof GM_info !== 'undefined' &amp;&amp; GM_info.script &amp;&amp; GM_info.script.version) {</w:t>
+      </w:r>
+    </w:p>
+    <w:p>
+      <w:pPr>
+        <w:spacing w:after="0" w:line="220"/>
+      </w:pPr>
+      <w:r>
+        <w:rPr>
+          <w:rFonts w:ascii="Consolas" w:cs="Consolas" w:eastAsia="Consolas" w:hAnsi="Consolas"/>
+          <w:sz w:val="16"/>
+          <w:szCs w:val="16"/>
+        </w:rPr>
+        <w:t xml:space="preserve">        return GM_info.script.version;</w:t>
+      </w:r>
+    </w:p>
+    <w:p>
+      <w:pPr>
+        <w:spacing w:after="0" w:line="220"/>
+      </w:pPr>
+      <w:r>
+        <w:rPr>
+          <w:rFonts w:ascii="Consolas" w:cs="Consolas" w:eastAsia="Consolas" w:hAnsi="Consolas"/>
+          <w:sz w:val="16"/>
+          <w:szCs w:val="16"/>
+        </w:rPr>
+        <w:t xml:space="preserve">      }</w:t>
+      </w:r>
+    </w:p>
+    <w:p>
+      <w:pPr>
+        <w:spacing w:after="0" w:line="220"/>
+      </w:pPr>
+      <w:r>
+        <w:rPr>
+          <w:rFonts w:ascii="Consolas" w:cs="Consolas" w:eastAsia="Consolas" w:hAnsi="Consolas"/>
+          <w:sz w:val="16"/>
+          <w:szCs w:val="16"/>
+        </w:rPr>
+        <w:t xml:space="preserve">    } catch (_) { }</w:t>
+      </w:r>
+    </w:p>
+    <w:p>
+      <w:pPr>
+        <w:spacing w:after="0" w:line="220"/>
+      </w:pPr>
+      <w:r>
+        <w:rPr>
+          <w:rFonts w:ascii="Consolas" w:cs="Consolas" w:eastAsia="Consolas" w:hAnsi="Consolas"/>
+          <w:sz w:val="16"/>
+          <w:szCs w:val="16"/>
+        </w:rPr>
+        <w:t xml:space="preserve">    return '1.7.1';</w:t>
+      </w:r>
+    </w:p>
+    <w:p>
+      <w:pPr>
+        <w:spacing w:after="0" w:line="220"/>
+      </w:pPr>
+      <w:r>
+        <w:rPr>
+          <w:rFonts w:ascii="Consolas" w:cs="Consolas" w:eastAsia="Consolas" w:hAnsi="Consolas"/>
+          <w:sz w:val="16"/>
+          <w:szCs w:val="16"/>
+        </w:rPr>
+        <w:t xml:space="preserve">  })();</w:t>
+      </w:r>
+    </w:p>
+    <w:p>
+      <w:pPr>
+        <w:spacing w:after="0" w:line="220"/>
+      </w:pPr>
+      <w:r>
+        <w:rPr>
+          <w:rFonts w:ascii="Consolas" w:cs="Consolas" w:eastAsia="Consolas" w:hAnsi="Consolas"/>
+          <w:sz w:val="16"/>
+          <w:szCs w:val="16"/>
+        </w:rPr>
+        <w:t xml:space="preserve"> </w:t>
+      </w:r>
+    </w:p>
+    <w:p>
+      <w:pPr>
+        <w:spacing w:after="0" w:line="220"/>
+      </w:pPr>
+      <w:r>
+        <w:rPr>
+          <w:rFonts w:ascii="Consolas" w:cs="Consolas" w:eastAsia="Consolas" w:hAnsi="Consolas"/>
+          <w:sz w:val="16"/>
+          <w:szCs w:val="16"/>
+        </w:rPr>
         <w:t xml:space="preserve">  // ───────────────── column lists (verbatim from v9.2 ADP Multi-Mode Assistant) ─────────────────</w:t>
       </w:r>
     </w:p>
@@ -50634,7 +50777,33 @@
           <w:sz w:val="16"/>
           <w:szCs w:val="16"/>
         </w:rPr>
-        <w:t xml:space="preserve">    versionTag.textContent = 'v1.0';</w:t>
+        <w:t xml:space="preserve">    // Never hardcode this: the badge read 'v1.0' while @version was 1.7.0, so</w:t>
+      </w:r>
+    </w:p>
+    <w:p>
+      <w:pPr>
+        <w:spacing w:after="0" w:line="220"/>
+      </w:pPr>
+      <w:r>
+        <w:rPr>
+          <w:rFonts w:ascii="Consolas" w:cs="Consolas" w:eastAsia="Consolas" w:hAnsi="Consolas"/>
+          <w:sz w:val="16"/>
+          <w:szCs w:val="16"/>
+        </w:rPr>
+        <w:t xml:space="preserve">    // the panel could not be used to tell which build was actually loaded.</w:t>
+      </w:r>
+    </w:p>
+    <w:p>
+      <w:pPr>
+        <w:spacing w:after="0" w:line="220"/>
+      </w:pPr>
+      <w:r>
+        <w:rPr>
+          <w:rFonts w:ascii="Consolas" w:cs="Consolas" w:eastAsia="Consolas" w:hAnsi="Consolas"/>
+          <w:sz w:val="16"/>
+          <w:szCs w:val="16"/>
+        </w:rPr>
+        <w:t xml:space="preserve">    versionTag.textContent = 'v' + SCRIPT_VERSION;</w:t>
       </w:r>
     </w:p>
     <w:p>

</xml_diff>